<commit_message>
feat: add chi-square association tests and salary t-tests for descriptive analysis in Stata script and update thesis documentation
</commit_message>
<xml_diff>
--- a/LASTDiplomova_prace_Murcek.docx
+++ b/LASTDiplomova_prace_Murcek.docx
@@ -10512,6 +10512,9 @@
         <w:t>Výsledky</w:t>
       </w:r>
       <w:bookmarkEnd w:id="112"/>
+      <w:r>
+        <w:t xml:space="preserve"> analýzy</w:t>
+      </w:r>
     </w:p>
     <w:p>
       <w:r>
@@ -10519,7 +10522,28 @@
       </w:r>
       <w:commentRangeStart w:id="113"/>
       <w:r>
-        <w:t xml:space="preserve">poptávky po AI dovednostech v IT pracovních inzerátech. </w:t>
+        <w:t>poptávky po AI dovednostech v IT pracovních inzerátech</w:t>
+      </w:r>
+      <w:r>
+        <w:t xml:space="preserve"> ve třech zemích, USA, Německu a Indii</w:t>
+      </w:r>
+      <w:r>
+        <w:t xml:space="preserve"> (</w:t>
+      </w:r>
+      <w:r>
+        <w:t>38 43</w:t>
+      </w:r>
+      <w:r>
+        <w:t>6</w:t>
+      </w:r>
+      <w:r>
+        <w:t xml:space="preserve"> inzerátů</w:t>
+      </w:r>
+      <w:r>
+        <w:t>)</w:t>
+      </w:r>
+      <w:r>
+        <w:t xml:space="preserve">. </w:t>
       </w:r>
       <w:commentRangeEnd w:id="113"/>
       <w:r>
@@ -10534,79 +10558,88 @@
         <w:t xml:space="preserve"> </w:t>
       </w:r>
       <w:r>
-        <w:t>Na počátku je popsán</w:t>
-      </w:r>
-      <w:r>
-        <w:t xml:space="preserve"> zkoumaný vzorek a jeho základní charakteristiky. </w:t>
-      </w:r>
-      <w:r>
-        <w:t>Cílem této části je analyzovat</w:t>
-      </w:r>
-      <w:r>
-        <w:t>, které pozice a dovednosti s AI požadavky souvisejí</w:t>
+        <w:t xml:space="preserve">Nejprve je </w:t>
+      </w:r>
+      <w:r>
+        <w:t>popsán</w:t>
+      </w:r>
+      <w:r>
+        <w:t xml:space="preserve"> zkoumaný vzorek a jeho základní charakteristiky.</w:t>
+      </w:r>
+      <w:r>
+        <w:t xml:space="preserve"> </w:t>
+      </w:r>
+      <w:r>
+        <w:t>Následně</w:t>
+      </w:r>
+      <w:r>
+        <w:t xml:space="preserve"> je analyzováno,</w:t>
+      </w:r>
+      <w:r>
+        <w:t xml:space="preserve"> </w:t>
+      </w:r>
+      <w:r>
+        <w:t>které pozice a dovednosti s AI požadavky souvisejí</w:t>
       </w:r>
       <w:r>
         <w:t xml:space="preserve"> a</w:t>
       </w:r>
       <w:r>
-        <w:t xml:space="preserve"> jak se AI kompetence </w:t>
+        <w:t xml:space="preserve"> jak se AI </w:t>
+      </w:r>
+      <w:r>
+        <w:t>dovednosti</w:t>
+      </w:r>
+      <w:r>
+        <w:t xml:space="preserve"> </w:t>
       </w:r>
       <w:r>
         <w:t xml:space="preserve">následně </w:t>
       </w:r>
       <w:r>
-        <w:t>promítají do mezd.</w:t>
-      </w:r>
-      <w:r>
-        <w:t xml:space="preserve"> </w:t>
-      </w:r>
-      <w:r>
-        <w:t>Nejprve je prezentována komparativní</w:t>
-      </w:r>
-      <w:r>
-        <w:t xml:space="preserve"> analýza</w:t>
-      </w:r>
-      <w:r>
-        <w:t xml:space="preserve"> USA, Německa a Indie (</w:t>
-      </w:r>
-      <w:r>
-        <w:t xml:space="preserve">celkem </w:t>
-      </w:r>
-      <w:r>
-        <w:t>38 43</w:t>
-      </w:r>
-      <w:r>
-        <w:t>6</w:t>
-      </w:r>
-      <w:r>
-        <w:t xml:space="preserve"> inzerátů)</w:t>
-      </w:r>
-      <w:r>
-        <w:t xml:space="preserve">, poté je provedeno detailněji zaměření na </w:t>
-      </w:r>
-      <w:r>
-        <w:t>americk</w:t>
-      </w:r>
-      <w:r>
-        <w:t>ý</w:t>
-      </w:r>
-      <w:r>
-        <w:t xml:space="preserve"> trh práce</w:t>
-      </w:r>
-      <w:r>
-        <w:t xml:space="preserve"> jakožto největší</w:t>
-      </w:r>
-      <w:r>
-        <w:t xml:space="preserve"> </w:t>
-      </w:r>
-      <w:r>
-        <w:t xml:space="preserve">vzorek dat </w:t>
-      </w:r>
-      <w:r>
-        <w:t>(17 848 inzerátů)</w:t>
-      </w:r>
-      <w:r>
-        <w:t>.</w:t>
+        <w:t>promítají do mezd</w:t>
+      </w:r>
+      <w:r>
+        <w:t xml:space="preserve">. Kapitolu uzavírá </w:t>
+      </w:r>
+      <w:r>
+        <w:t>hlubší</w:t>
+      </w:r>
+      <w:r>
+        <w:t xml:space="preserve"> inkrementální a mediační analýza </w:t>
+      </w:r>
+      <w:r>
+        <w:t xml:space="preserve">provedena </w:t>
+      </w:r>
+      <w:r>
+        <w:t>na</w:t>
+      </w:r>
+      <w:r>
+        <w:t xml:space="preserve"> čistě</w:t>
+      </w:r>
+      <w:r>
+        <w:t xml:space="preserve"> americkém vzorku</w:t>
+      </w:r>
+      <w:r>
+        <w:t xml:space="preserve"> dat</w:t>
+      </w:r>
+      <w:r>
+        <w:t xml:space="preserve"> (</w:t>
+      </w:r>
+      <w:r>
+        <w:t>17 848 inzerátů</w:t>
+      </w:r>
+      <w:r>
+        <w:t>)</w:t>
+      </w:r>
+      <w:r>
+        <w:t xml:space="preserve">, která těží z jeho velikosti a </w:t>
+      </w:r>
+      <w:r>
+        <w:t xml:space="preserve">dále </w:t>
+      </w:r>
+      <w:r>
+        <w:t>ilustruje mechanismy stojící za komparativními zjištěními.</w:t>
       </w:r>
     </w:p>
     <w:p>

</xml_diff>